<commit_message>
docs: present party identification as a paragraph
</commit_message>
<xml_diff>
--- a/docs/contratos/Contrato_R360.docx
+++ b/docs/contratos/Contrato_R360.docx
@@ -31,668 +31,13 @@
         <w:jc w:val="left"/>
       </w:pPr>
       <w:r>
-        <w:t>Celebran este contrato, por una parte, ______________________________, en adelante «EL CLIENTE» y, por otra, Roberto Alejandro Guzmán Winzig, persona física que actúa por su propio derecho, en adelante «EL PRESTADOR», conjuntamente «LAS PARTES», conforme a las declaraciones, cláusulas y anexos siguientes.</w:t>
-      </w:r>
-    </w:p>
-    <w:tbl>
-      <w:tblPr>
-        <w:tblW w:type="auto" w:w="0"/>
-        <w:jc w:val="center"/>
-        <w:tblLayout w:type="fixed"/>
-        <w:tblLook w:firstColumn="1" w:firstRow="1" w:lastColumn="0" w:lastRow="0" w:noHBand="0" w:noVBand="1" w:val="04A0"/>
-        <w:tblBorders>
-          <w:top w:val="single" w:sz="4" w:color="000000"/>
-          <w:left w:val="single" w:sz="4" w:color="000000"/>
-          <w:bottom w:val="single" w:sz="4" w:color="000000"/>
-          <w:right w:val="single" w:sz="4" w:color="000000"/>
-          <w:insideH w:val="single" w:sz="4" w:color="000000"/>
-          <w:insideV w:val="single" w:sz="4" w:color="000000"/>
-        </w:tblBorders>
-      </w:tblPr>
-      <w:tblGrid>
-        <w:gridCol w:w="2200"/>
-        <w:gridCol w:w="3580"/>
-        <w:gridCol w:w="3580"/>
-      </w:tblGrid>
-      <w:tr>
-        <w:trPr>
-          <w:tblHeader/>
-          <w:cantSplit/>
-        </w:trPr>
-        <w:tc>
-          <w:tcPr>
-            <w:tcW w:type="dxa" w:w="2200"/>
-            <w:vAlign w:val="top"/>
-          </w:tcPr>
-          <w:p>
-            <w:pPr>
-              <w:spacing w:after="60"/>
-              <w:jc w:val="left"/>
-            </w:pPr>
-            <w:r>
-              <w:rPr>
-                <w:rFonts w:ascii="Times New Roman" w:hAnsi="Times New Roman"/>
-                <w:b/>
-                <w:color w:val="000000"/>
-                <w:sz w:val="19"/>
-              </w:rPr>
-              <w:t>Dato</w:t>
-            </w:r>
-          </w:p>
-        </w:tc>
-        <w:tc>
-          <w:tcPr>
-            <w:tcW w:type="dxa" w:w="3580"/>
-            <w:vAlign w:val="top"/>
-          </w:tcPr>
-          <w:p>
-            <w:pPr>
-              <w:spacing w:after="60"/>
-              <w:jc w:val="left"/>
-            </w:pPr>
-            <w:r>
-              <w:rPr>
-                <w:rFonts w:ascii="Times New Roman" w:hAnsi="Times New Roman"/>
-                <w:b/>
-                <w:color w:val="000000"/>
-                <w:sz w:val="19"/>
-              </w:rPr>
-              <w:t>EL CLIENTE</w:t>
-            </w:r>
-          </w:p>
-        </w:tc>
-        <w:tc>
-          <w:tcPr>
-            <w:tcW w:type="dxa" w:w="3580"/>
-            <w:vAlign w:val="top"/>
-          </w:tcPr>
-          <w:p>
-            <w:pPr>
-              <w:spacing w:after="60"/>
-              <w:jc w:val="left"/>
-            </w:pPr>
-            <w:r>
-              <w:rPr>
-                <w:rFonts w:ascii="Times New Roman" w:hAnsi="Times New Roman"/>
-                <w:b/>
-                <w:color w:val="000000"/>
-                <w:sz w:val="19"/>
-              </w:rPr>
-              <w:t>EL PRESTADOR</w:t>
-            </w:r>
-          </w:p>
-        </w:tc>
-      </w:tr>
-      <w:tr>
-        <w:trPr>
-          <w:cantSplit/>
-        </w:trPr>
-        <w:tc>
-          <w:tcPr>
-            <w:tcW w:type="dxa" w:w="2200"/>
-            <w:vAlign w:val="top"/>
-          </w:tcPr>
-          <w:p>
-            <w:pPr>
-              <w:spacing w:after="60"/>
-              <w:jc w:val="left"/>
-            </w:pPr>
-            <w:r>
-              <w:rPr>
-                <w:rFonts w:ascii="Times New Roman" w:hAnsi="Times New Roman"/>
-                <w:b w:val="0"/>
-                <w:color w:val="000000"/>
-                <w:sz w:val="19"/>
-              </w:rPr>
-              <w:t>Nombre o razón social</w:t>
-            </w:r>
-          </w:p>
-        </w:tc>
-        <w:tc>
-          <w:tcPr>
-            <w:tcW w:type="dxa" w:w="3580"/>
-            <w:vAlign w:val="top"/>
-          </w:tcPr>
-          <w:p>
-            <w:pPr>
-              <w:spacing w:after="60"/>
-              <w:jc w:val="left"/>
-            </w:pPr>
-            <w:r>
-              <w:rPr>
-                <w:rFonts w:ascii="Times New Roman" w:hAnsi="Times New Roman"/>
-                <w:b w:val="0"/>
-                <w:color w:val="000000"/>
-                <w:sz w:val="19"/>
-              </w:rPr>
-              <w:t>______________________________</w:t>
-            </w:r>
-          </w:p>
-        </w:tc>
-        <w:tc>
-          <w:tcPr>
-            <w:tcW w:type="dxa" w:w="3580"/>
-            <w:vAlign w:val="top"/>
-          </w:tcPr>
-          <w:p>
-            <w:pPr>
-              <w:spacing w:after="60"/>
-              <w:jc w:val="left"/>
-            </w:pPr>
-            <w:r>
-              <w:rPr>
-                <w:rFonts w:ascii="Times New Roman" w:hAnsi="Times New Roman"/>
-                <w:b w:val="0"/>
-                <w:color w:val="000000"/>
-                <w:sz w:val="19"/>
-              </w:rPr>
-              <w:t>Roberto Alejandro Guzmán Winzig</w:t>
-            </w:r>
-          </w:p>
-        </w:tc>
-      </w:tr>
-      <w:tr>
-        <w:trPr>
-          <w:cantSplit/>
-        </w:trPr>
-        <w:tc>
-          <w:tcPr>
-            <w:tcW w:type="dxa" w:w="2200"/>
-            <w:vAlign w:val="top"/>
-          </w:tcPr>
-          <w:p>
-            <w:pPr>
-              <w:spacing w:after="60"/>
-              <w:jc w:val="left"/>
-            </w:pPr>
-            <w:r>
-              <w:rPr>
-                <w:rFonts w:ascii="Times New Roman" w:hAnsi="Times New Roman"/>
-                <w:b w:val="0"/>
-                <w:color w:val="000000"/>
-                <w:sz w:val="19"/>
-              </w:rPr>
-              <w:t>Carácter de contratación</w:t>
-            </w:r>
-          </w:p>
-        </w:tc>
-        <w:tc>
-          <w:tcPr>
-            <w:tcW w:type="dxa" w:w="3580"/>
-            <w:vAlign w:val="top"/>
-          </w:tcPr>
-          <w:p>
-            <w:pPr>
-              <w:spacing w:after="60"/>
-              <w:jc w:val="left"/>
-            </w:pPr>
-            <w:r>
-              <w:rPr>
-                <w:rFonts w:ascii="Times New Roman" w:hAnsi="Times New Roman"/>
-                <w:b w:val="0"/>
-                <w:color w:val="000000"/>
-                <w:sz w:val="19"/>
-              </w:rPr>
-              <w:t>____________________</w:t>
-            </w:r>
-          </w:p>
-        </w:tc>
-        <w:tc>
-          <w:tcPr>
-            <w:tcW w:type="dxa" w:w="3580"/>
-            <w:vAlign w:val="top"/>
-          </w:tcPr>
-          <w:p>
-            <w:pPr>
-              <w:spacing w:after="60"/>
-              <w:jc w:val="left"/>
-            </w:pPr>
-            <w:r>
-              <w:rPr>
-                <w:rFonts w:ascii="Times New Roman" w:hAnsi="Times New Roman"/>
-                <w:b w:val="0"/>
-                <w:color w:val="000000"/>
-                <w:sz w:val="19"/>
-              </w:rPr>
-              <w:t>Persona física, por propio derecho</w:t>
-            </w:r>
-          </w:p>
-        </w:tc>
-      </w:tr>
-      <w:tr>
-        <w:trPr>
-          <w:cantSplit/>
-        </w:trPr>
-        <w:tc>
-          <w:tcPr>
-            <w:tcW w:type="dxa" w:w="2200"/>
-            <w:vAlign w:val="top"/>
-          </w:tcPr>
-          <w:p>
-            <w:pPr>
-              <w:spacing w:after="60"/>
-              <w:jc w:val="left"/>
-            </w:pPr>
-            <w:r>
-              <w:rPr>
-                <w:rFonts w:ascii="Times New Roman" w:hAnsi="Times New Roman"/>
-                <w:b w:val="0"/>
-                <w:color w:val="000000"/>
-                <w:sz w:val="19"/>
-              </w:rPr>
-              <w:t>RFC</w:t>
-            </w:r>
-          </w:p>
-        </w:tc>
-        <w:tc>
-          <w:tcPr>
-            <w:tcW w:type="dxa" w:w="3580"/>
-            <w:vAlign w:val="top"/>
-          </w:tcPr>
-          <w:p>
-            <w:pPr>
-              <w:spacing w:after="60"/>
-              <w:jc w:val="left"/>
-            </w:pPr>
-            <w:r>
-              <w:rPr>
-                <w:rFonts w:ascii="Times New Roman" w:hAnsi="Times New Roman"/>
-                <w:b w:val="0"/>
-                <w:color w:val="000000"/>
-                <w:sz w:val="19"/>
-              </w:rPr>
-              <w:t>____________________</w:t>
-            </w:r>
-          </w:p>
-        </w:tc>
-        <w:tc>
-          <w:tcPr>
-            <w:tcW w:type="dxa" w:w="3580"/>
-            <w:vAlign w:val="top"/>
-          </w:tcPr>
-          <w:p>
-            <w:pPr>
-              <w:spacing w:after="60"/>
-              <w:jc w:val="left"/>
-            </w:pPr>
-            <w:r>
-              <w:rPr>
-                <w:rFonts w:ascii="Times New Roman" w:hAnsi="Times New Roman"/>
-                <w:b w:val="0"/>
-                <w:color w:val="000000"/>
-                <w:sz w:val="19"/>
-              </w:rPr>
-              <w:t>____________________</w:t>
-            </w:r>
-          </w:p>
-        </w:tc>
-      </w:tr>
-      <w:tr>
-        <w:trPr>
-          <w:cantSplit/>
-        </w:trPr>
-        <w:tc>
-          <w:tcPr>
-            <w:tcW w:type="dxa" w:w="2200"/>
-            <w:vAlign w:val="top"/>
-          </w:tcPr>
-          <w:p>
-            <w:pPr>
-              <w:spacing w:after="60"/>
-              <w:jc w:val="left"/>
-            </w:pPr>
-            <w:r>
-              <w:rPr>
-                <w:rFonts w:ascii="Times New Roman" w:hAnsi="Times New Roman"/>
-                <w:b w:val="0"/>
-                <w:color w:val="000000"/>
-                <w:sz w:val="19"/>
-              </w:rPr>
-              <w:t>Domicilio fiscal y para avisos</w:t>
-            </w:r>
-          </w:p>
-        </w:tc>
-        <w:tc>
-          <w:tcPr>
-            <w:tcW w:type="dxa" w:w="3580"/>
-            <w:vAlign w:val="top"/>
-          </w:tcPr>
-          <w:p>
-            <w:pPr>
-              <w:spacing w:after="60"/>
-              <w:jc w:val="left"/>
-            </w:pPr>
-            <w:r>
-              <w:rPr>
-                <w:rFonts w:ascii="Times New Roman" w:hAnsi="Times New Roman"/>
-                <w:b w:val="0"/>
-                <w:color w:val="000000"/>
-                <w:sz w:val="19"/>
-              </w:rPr>
-              <w:t>____________________</w:t>
-            </w:r>
-          </w:p>
-        </w:tc>
-        <w:tc>
-          <w:tcPr>
-            <w:tcW w:type="dxa" w:w="3580"/>
-            <w:vAlign w:val="top"/>
-          </w:tcPr>
-          <w:p>
-            <w:pPr>
-              <w:spacing w:after="60"/>
-              <w:jc w:val="left"/>
-            </w:pPr>
-            <w:r>
-              <w:rPr>
-                <w:rFonts w:ascii="Times New Roman" w:hAnsi="Times New Roman"/>
-                <w:b w:val="0"/>
-                <w:color w:val="000000"/>
-                <w:sz w:val="19"/>
-              </w:rPr>
-              <w:t>____________________</w:t>
-            </w:r>
-          </w:p>
-        </w:tc>
-      </w:tr>
-      <w:tr>
-        <w:trPr>
-          <w:cantSplit/>
-        </w:trPr>
-        <w:tc>
-          <w:tcPr>
-            <w:tcW w:type="dxa" w:w="2200"/>
-            <w:vAlign w:val="top"/>
-          </w:tcPr>
-          <w:p>
-            <w:pPr>
-              <w:spacing w:after="60"/>
-              <w:jc w:val="left"/>
-            </w:pPr>
-            <w:r>
-              <w:rPr>
-                <w:rFonts w:ascii="Times New Roman" w:hAnsi="Times New Roman"/>
-                <w:b w:val="0"/>
-                <w:color w:val="000000"/>
-                <w:sz w:val="19"/>
-              </w:rPr>
-              <w:t>Representante y cargo, si aplica</w:t>
-            </w:r>
-          </w:p>
-        </w:tc>
-        <w:tc>
-          <w:tcPr>
-            <w:tcW w:type="dxa" w:w="3580"/>
-            <w:vAlign w:val="top"/>
-          </w:tcPr>
-          <w:p>
-            <w:pPr>
-              <w:spacing w:after="60"/>
-              <w:jc w:val="left"/>
-            </w:pPr>
-            <w:r>
-              <w:rPr>
-                <w:rFonts w:ascii="Times New Roman" w:hAnsi="Times New Roman"/>
-                <w:b w:val="0"/>
-                <w:color w:val="000000"/>
-                <w:sz w:val="19"/>
-              </w:rPr>
-              <w:t>____________________</w:t>
-            </w:r>
-          </w:p>
-        </w:tc>
-        <w:tc>
-          <w:tcPr>
-            <w:tcW w:type="dxa" w:w="3580"/>
-            <w:vAlign w:val="top"/>
-          </w:tcPr>
-          <w:p>
-            <w:pPr>
-              <w:spacing w:after="60"/>
-              <w:jc w:val="left"/>
-            </w:pPr>
-            <w:r>
-              <w:rPr>
-                <w:rFonts w:ascii="Times New Roman" w:hAnsi="Times New Roman"/>
-                <w:b w:val="0"/>
-                <w:color w:val="000000"/>
-                <w:sz w:val="19"/>
-              </w:rPr>
-              <w:t>No aplica; firma por propio derecho</w:t>
-            </w:r>
-          </w:p>
-        </w:tc>
-      </w:tr>
-      <w:tr>
-        <w:trPr>
-          <w:cantSplit/>
-        </w:trPr>
-        <w:tc>
-          <w:tcPr>
-            <w:tcW w:type="dxa" w:w="2200"/>
-            <w:vAlign w:val="top"/>
-          </w:tcPr>
-          <w:p>
-            <w:pPr>
-              <w:spacing w:after="60"/>
-              <w:jc w:val="left"/>
-            </w:pPr>
-            <w:r>
-              <w:rPr>
-                <w:rFonts w:ascii="Times New Roman" w:hAnsi="Times New Roman"/>
-                <w:b w:val="0"/>
-                <w:color w:val="000000"/>
-                <w:sz w:val="19"/>
-              </w:rPr>
-              <w:t>Instrumento de constitución y poderes, si aplica</w:t>
-            </w:r>
-          </w:p>
-        </w:tc>
-        <w:tc>
-          <w:tcPr>
-            <w:tcW w:type="dxa" w:w="3580"/>
-            <w:vAlign w:val="top"/>
-          </w:tcPr>
-          <w:p>
-            <w:pPr>
-              <w:spacing w:after="60"/>
-              <w:jc w:val="left"/>
-            </w:pPr>
-            <w:r>
-              <w:rPr>
-                <w:rFonts w:ascii="Times New Roman" w:hAnsi="Times New Roman"/>
-                <w:b w:val="0"/>
-                <w:color w:val="000000"/>
-                <w:sz w:val="19"/>
-              </w:rPr>
-              <w:t>____________________</w:t>
-            </w:r>
-          </w:p>
-        </w:tc>
-        <w:tc>
-          <w:tcPr>
-            <w:tcW w:type="dxa" w:w="3580"/>
-            <w:vAlign w:val="top"/>
-          </w:tcPr>
-          <w:p>
-            <w:pPr>
-              <w:spacing w:after="60"/>
-              <w:jc w:val="left"/>
-            </w:pPr>
-            <w:r>
-              <w:rPr>
-                <w:rFonts w:ascii="Times New Roman" w:hAnsi="Times New Roman"/>
-                <w:b w:val="0"/>
-                <w:color w:val="000000"/>
-                <w:sz w:val="19"/>
-              </w:rPr>
-              <w:t>No aplica</w:t>
-            </w:r>
-          </w:p>
-        </w:tc>
-      </w:tr>
-      <w:tr>
-        <w:trPr>
-          <w:cantSplit/>
-        </w:trPr>
-        <w:tc>
-          <w:tcPr>
-            <w:tcW w:type="dxa" w:w="2200"/>
-            <w:vAlign w:val="top"/>
-          </w:tcPr>
-          <w:p>
-            <w:pPr>
-              <w:spacing w:after="60"/>
-              <w:jc w:val="left"/>
-            </w:pPr>
-            <w:r>
-              <w:rPr>
-                <w:rFonts w:ascii="Times New Roman" w:hAnsi="Times New Roman"/>
-                <w:b w:val="0"/>
-                <w:color w:val="000000"/>
-                <w:sz w:val="19"/>
-              </w:rPr>
-              <w:t>Correo para notificaciones contractuales</w:t>
-            </w:r>
-          </w:p>
-        </w:tc>
-        <w:tc>
-          <w:tcPr>
-            <w:tcW w:type="dxa" w:w="3580"/>
-            <w:vAlign w:val="top"/>
-          </w:tcPr>
-          <w:p>
-            <w:pPr>
-              <w:spacing w:after="60"/>
-              <w:jc w:val="left"/>
-            </w:pPr>
-            <w:r>
-              <w:rPr>
-                <w:rFonts w:ascii="Times New Roman" w:hAnsi="Times New Roman"/>
-                <w:b w:val="0"/>
-                <w:color w:val="000000"/>
-                <w:sz w:val="19"/>
-              </w:rPr>
-              <w:t>____________________</w:t>
-            </w:r>
-          </w:p>
-        </w:tc>
-        <w:tc>
-          <w:tcPr>
-            <w:tcW w:type="dxa" w:w="3580"/>
-            <w:vAlign w:val="top"/>
-          </w:tcPr>
-          <w:p>
-            <w:pPr>
-              <w:spacing w:after="60"/>
-              <w:jc w:val="left"/>
-            </w:pPr>
-            <w:r>
-              <w:rPr>
-                <w:rFonts w:ascii="Times New Roman" w:hAnsi="Times New Roman"/>
-                <w:b w:val="0"/>
-                <w:color w:val="000000"/>
-                <w:sz w:val="19"/>
-              </w:rPr>
-              <w:t>____________________</w:t>
-            </w:r>
-          </w:p>
-        </w:tc>
-      </w:tr>
-      <w:tr>
-        <w:trPr>
-          <w:cantSplit/>
-        </w:trPr>
-        <w:tc>
-          <w:tcPr>
-            <w:tcW w:type="dxa" w:w="2200"/>
-            <w:vAlign w:val="top"/>
-          </w:tcPr>
-          <w:p>
-            <w:pPr>
-              <w:spacing w:after="60"/>
-              <w:jc w:val="left"/>
-            </w:pPr>
-            <w:r>
-              <w:rPr>
-                <w:rFonts w:ascii="Times New Roman" w:hAnsi="Times New Roman"/>
-                <w:b w:val="0"/>
-                <w:color w:val="000000"/>
-                <w:sz w:val="19"/>
-              </w:rPr>
-              <w:t>Responsable del proyecto y correo</w:t>
-            </w:r>
-          </w:p>
-        </w:tc>
-        <w:tc>
-          <w:tcPr>
-            <w:tcW w:type="dxa" w:w="3580"/>
-            <w:vAlign w:val="top"/>
-          </w:tcPr>
-          <w:p>
-            <w:pPr>
-              <w:spacing w:after="60"/>
-              <w:jc w:val="left"/>
-            </w:pPr>
-            <w:r>
-              <w:rPr>
-                <w:rFonts w:ascii="Times New Roman" w:hAnsi="Times New Roman"/>
-                <w:b w:val="0"/>
-                <w:color w:val="000000"/>
-                <w:sz w:val="19"/>
-              </w:rPr>
-              <w:t>____________________</w:t>
-            </w:r>
-          </w:p>
-        </w:tc>
-        <w:tc>
-          <w:tcPr>
-            <w:tcW w:type="dxa" w:w="3580"/>
-            <w:vAlign w:val="top"/>
-          </w:tcPr>
-          <w:p>
-            <w:pPr>
-              <w:spacing w:after="60"/>
-              <w:jc w:val="left"/>
-            </w:pPr>
-            <w:r>
-              <w:rPr>
-                <w:rFonts w:ascii="Times New Roman" w:hAnsi="Times New Roman"/>
-                <w:b w:val="0"/>
-                <w:color w:val="000000"/>
-                <w:sz w:val="19"/>
-              </w:rPr>
-              <w:t>____________________</w:t>
-            </w:r>
-          </w:p>
-        </w:tc>
-      </w:tr>
-    </w:tbl>
-    <w:p/>
-    <w:p>
-      <w:pPr/>
-      <w:r>
-        <w:t>La denominación «R360» identifica el proyecto. La identidad y, en su caso, la representación de la parte contratante son las asentadas en esta sección.</w:t>
+        <w:t>Celebran este contrato, por una parte, ______________________________, quien actúa ______________________________, con RFC ____________________ y domicilio fiscal y para notificaciones en ____________________________________________________________, en adelante «EL CLIENTE»; y, por otra, Roberto Alejandro Guzmán Winzig, persona física que actúa por su propio derecho, con RFC ____________________ y domicilio fiscal y para notificaciones en ____________________________________________________________, en adelante «EL PRESTADOR»; conjuntamente, «LAS PARTES», conforme a las declaraciones, cláusulas y anexos siguientes.</w:t>
       </w:r>
     </w:p>
     <w:p>
       <w:pPr/>
       <w:r>
-        <w:t>El titular de los derechos patrimoniales sobre los resultados será EL CLIENTE o la persona que este designe por escrito, en adelante «EL CESIONARIO».</w:t>
-      </w:r>
-    </w:p>
-    <w:p>
-      <w:pPr>
-        <w:jc w:val="left"/>
-      </w:pPr>
-      <w:r>
-        <w:t>Nombre o razón social de EL CESIONARIO: ______________________________.</w:t>
-      </w:r>
-    </w:p>
-    <w:p>
-      <w:pPr/>
-      <w:r>
-        <w:t>Si EL CESIONARIO es distinto de EL CLIENTE, su designación y aceptación deberán constar por escrito y deberá suscribir el apartado de cesión correspondiente.</w:t>
+        <w:t>La denominación «R360» identifica el proyecto objeto de este contrato.</w:t>
       </w:r>
     </w:p>
     <w:p>
@@ -1133,7 +478,7 @@
     <w:p>
       <w:pPr/>
       <w:r>
-        <w:t>14.1. Al liquidarse el precio, EL PRESTADOR entregará los resultados definitivos y cederá por escrito, de forma exclusiva y onerosa, a EL CESIONARIO los derechos patrimoniales que le correspondan sobre el código a medida, diseños y documentación creados específicamente para el proyecto. La contraprestación de esta cesión se incluye en el precio del desarrollo y no genera un cobro adicional.</w:t>
+        <w:t>14.1. Al liquidarse el precio, EL PRESTADOR entregará los resultados definitivos y cederá por escrito, de forma exclusiva y onerosa, a EL CLIENTE o a la persona que este designe por escrito, en adelante «EL CESIONARIO», los derechos patrimoniales que le correspondan sobre el código a medida, diseños y documentación creados específicamente para el proyecto. La contraprestación de esta cesión se incluye en el precio del desarrollo y no genera un cobro adicional. Si EL CESIONARIO es distinto de EL CLIENTE, su designación y aceptación deberán constar por escrito.</w:t>
       </w:r>
     </w:p>
     <w:p>
@@ -1305,7 +650,7 @@
     <w:p>
       <w:pPr/>
       <w:r>
-        <w:t>19.1. Las notificaciones contractuales se enviarán a los correos y domicilios de la sección 1, con constancia de recepción. Si no hay confirmación verificable, se utilizará un medio alternativo que acredite entrega. Cada parte informará cambios de contacto; mientras no lo haga serán válidos los envíos acreditados al contacto designado.</w:t>
+        <w:t>19.1. Las notificaciones contractuales se practicarán en los domicilios establecidos en la sección 1 o por los medios electrónicos que LAS PARTES designen por escrito, con constancia de recepción. Si no hay confirmación verificable, se utilizará un medio alternativo que acredite entrega. Cada parte notificará cualquier cambio de domicilio o medio de comunicación; mientras no lo haga, serán válidos los envíos cuya recepción se acredite en los datos previamente designados.</w:t>
       </w:r>
     </w:p>
     <w:p>

</xml_diff>

<commit_message>
docs: name the project CRM Legal R360
</commit_message>
<xml_diff>
--- a/docs/contratos/Contrato_R360.docx
+++ b/docs/contratos/Contrato_R360.docx
@@ -15,7 +15,7 @@
         <w:pStyle w:val="Subtitle"/>
       </w:pPr>
       <w:r>
-        <w:t>Control de Servicios R360</w:t>
+        <w:t>CRM Legal R360</w:t>
       </w:r>
     </w:p>
     <w:p>
@@ -37,7 +37,7 @@
     <w:p>
       <w:pPr/>
       <w:r>
-        <w:t>La denominación «R360» identifica el proyecto objeto de este contrato.</w:t>
+        <w:t>La plataforma objeto de este contrato se denomina «CRM Legal R360».</w:t>
       </w:r>
     </w:p>
     <w:p>
@@ -104,7 +104,7 @@
     <w:p>
       <w:pPr/>
       <w:r>
-        <w:t>3.1. EL PRESTADOR diseñará, desarrollará, configurará, probará, desplegará y documentará Control de Servicios R360, capacitará a sus usuarios y entregará los resultados y derechos contratados. EL CLIENTE pagará el precio y colaborará en los términos convenidos.</w:t>
+        <w:t>3.1. EL PRESTADOR diseñará, desarrollará, configurará, probará, desplegará y documentará CRM Legal R360, capacitará a sus usuarios y entregará los resultados y derechos contratados. EL CLIENTE pagará el precio y colaborará en los términos convenidos.</w:t>
       </w:r>
     </w:p>
     <w:p>
@@ -871,7 +871,7 @@
     <w:p>
       <w:pPr/>
       <w:r>
-        <w:t>API para consultar, registrar y actualizar información autorizada de servicios habilitados, con autenticación, versionado, prevención de duplicados, documentación, errores y reintentos. Exportaciones PDF/CSV y equivalencias de datos para conexiones acordadas. La API de ambos servicios iniciales deberá funcionar y estar documentada al cierre del mes 2; posteriormente se ampliará al portafolio incorporado. Se incluye la importación y exportación por cliente de R360, individual y por lotes según el recorrido aprobado y el inventario de integraciones que LAS PARTES documenten durante el proyecto. Se definirá una estructura común de información de R360 y sus equivalencias con cada sistema externo. JSON será un formato preferente para API cuando el tercero lo soporte; los archivos de intercambio podrán ser JSON, CSV o Excel conforme a las especificaciones de cada conexión. La compatibilidad de cada conexión se determinará conforme a las especificaciones documentadas del sistema externo.</w:t>
+        <w:t>API para consultar, registrar y actualizar información autorizada de servicios habilitados, con autenticación, versionado, prevención de duplicados, documentación, errores y reintentos. Exportaciones PDF/CSV y equivalencias de datos para conexiones acordadas. La API de ambos servicios iniciales deberá funcionar y estar documentada al cierre del mes 2; posteriormente se ampliará al portafolio incorporado. Se incluye la importación y exportación por cliente de R360, individual y por lotes según el recorrido aprobado y el inventario de integraciones que LAS PARTES documenten durante el proyecto. Se definirá una estructura común de información de CRM Legal R360 y sus equivalencias con cada sistema externo. JSON será un formato preferente para API cuando el tercero lo soporte; los archivos de intercambio podrán ser JSON, CSV o Excel conforme a las especificaciones de cada conexión. La compatibilidad de cada conexión se determinará conforme a las especificaciones documentadas del sistema externo.</w:t>
       </w:r>
     </w:p>
     <w:p>

</xml_diff>

<commit_message>
docs: identify Eric as the individual contracting client
</commit_message>
<xml_diff>
--- a/docs/contratos/Contrato_R360.docx
+++ b/docs/contratos/Contrato_R360.docx
@@ -31,7 +31,7 @@
         <w:jc w:val="left"/>
       </w:pPr>
       <w:r>
-        <w:t>Celebran este contrato, por una parte, ______________________________, quien actúa ______________________________, con RFC ____________________ y domicilio fiscal y para notificaciones en ____________________________________________________________, en adelante «EL CLIENTE»; y, por otra, Roberto Alejandro Guzmán Winzig, persona física que actúa por su propio derecho, con RFC ____________________ y domicilio fiscal y para notificaciones en ____________________________________________________________, en adelante «EL PRESTADOR»; conjuntamente, «LAS PARTES», conforme a las declaraciones, cláusulas y anexos siguientes.</w:t>
+        <w:t>Celebran este contrato, por una parte, Eric ______________________________, persona física que actúa por su propio derecho, con RFC ____________________ y domicilio fiscal y para notificaciones en ____________________________________________________________, en adelante «EL CLIENTE»; y, por otra, Roberto Alejandro Guzmán Winzig, persona física que actúa por su propio derecho, con RFC ____________________ y domicilio fiscal y para notificaciones en ____________________________________________________________, en adelante «EL PRESTADOR»; conjuntamente, «LAS PARTES», conforme a las declaraciones, cláusulas y anexos siguientes.</w:t>
       </w:r>
     </w:p>
     <w:p>
@@ -72,7 +72,7 @@
     <w:p>
       <w:pPr/>
       <w:r>
-        <w:t>2.1. Cada parte declara tener capacidad legal para obligarse y, cuando actúe mediante representante, contar con facultades vigentes y suficientes. Entregará a la otra los datos fiscales y los documentos de identificación y representación necesarios, por medios seguros.</w:t>
+        <w:t>2.1. LAS PARTES declaran ser personas físicas, actuar por su propio derecho y tener capacidad legal para obligarse. Se proporcionarán los datos fiscales y documentos de identificación necesarios por medios seguros.</w:t>
       </w:r>
     </w:p>
     <w:p>
@@ -116,7 +116,7 @@
     <w:p>
       <w:pPr/>
       <w:r>
-        <w:t>3.3. Una modificación firmada posterior prevalecerá únicamente sobre lo que cambie de manera expresa. Para lo restante prevalecen este contrato y sus anexos sobre la cotización. Ningún acta operativa podrá eliminar prestaciones cotizadas, aumentar el precio, ceder derechos o imponer penalizaciones sin autorización contractual expresa de representantes facultados.</w:t>
+        <w:t>3.3. Una modificación firmada posterior prevalecerá únicamente sobre lo que cambie de manera expresa. Para lo restante prevalecen este contrato y sus anexos sobre la cotización. Ningún acta operativa podrá eliminar prestaciones cotizadas, aumentar el precio, ceder derechos o imponer penalizaciones sin autorización contractual expresa de LAS PARTES.</w:t>
       </w:r>
     </w:p>
     <w:p>
@@ -156,13 +156,13 @@
     <w:p>
       <w:pPr/>
       <w:r>
-        <w:t>4.3. No se incluyen funciones de inteligencia artificial, transferencia de dinero, emisión de CFDI por la plataforma ni garantías de resultado jurídico. La Asesoría Telefónica incluida en el portafolio consiste en la administración del servicio profesional. Se incluye la importación y exportación por cliente de R360, también por lotes, con formatos y reglas definidos conforme a A.6; la definición de sus especificaciones no constituye, por sí misma, una ampliación cobrable.</w:t>
+        <w:t>4.3. No se incluyen funciones de inteligencia artificial, transferencia de dinero, emisión de CFDI por la plataforma ni garantías de resultado jurídico. La Asesoría Telefónica incluida en el portafolio consiste en la administración del servicio profesional. Se incluye la importación y exportación por cliente administrado a través de la plataforma, también por lotes, con formatos y reglas definidos conforme a A.6; la definición de sus especificaciones no constituye, por sí misma, una ampliación cobrable.</w:t>
       </w:r>
     </w:p>
     <w:p>
       <w:pPr/>
       <w:r>
-        <w:t>4.4. Se incluyen el intercambio y las integraciones de información por cliente de R360 comprendidos en el precio. LAS PARTES identificarán por escrito los clientes y los sistemas objeto de integración, así como los recorridos cubiertos, conforme se definan durante el proyecto, sin presumir un número ilimitado de conectores futuros. Cada conexión requiere conocer el sistema externo, obtener documentación, muestras, accesos, licencias y autorizaciones válidas. La definición de un conector incluido no autoriza un nuevo cobro; cualquier ampliación real deberá justificarse y aprobarse conforme a la cláusula 10. No se presume que todos los clientes dispongan de la misma API o formato.</w:t>
+        <w:t>4.4. Se incluyen el intercambio y las integraciones de información por cliente administrado a través de la plataforma comprendidos en el precio. LAS PARTES identificarán por escrito los clientes y los sistemas objeto de integración, así como los recorridos cubiertos, conforme se definan durante el proyecto, sin presumir un número ilimitado de conectores futuros. Cada conexión requiere conocer el sistema externo, obtener documentación, muestras, accesos, licencias y autorizaciones válidas. La definición de un conector incluido no autoriza un nuevo cobro; cualquier ampliación real deberá justificarse y aprobarse conforme a la cláusula 10. No se presume que todos los clientes dispongan de la misma API o formato.</w:t>
       </w:r>
     </w:p>
     <w:p>
@@ -214,7 +214,7 @@
     <w:p>
       <w:pPr/>
       <w:r>
-        <w:t>6.1. EL CLIENTE designará un responsable con facultades operativas de decisión y validación. Cabina, jurídico y gestoría participarán en sus recorridos. Solo representantes con facultades suficientes podrán autorizar cambios de precio, alcance contractual, plazo o derechos.</w:t>
+        <w:t>6.1. EL CLIENTE designará un responsable con facultades operativas de decisión y validación. Cabina, jurídico y gestoría participarán en sus recorridos. Los cambios de precio, alcance contractual, plazo o derechos requerirán autorización expresa de LAS PARTES.</w:t>
       </w:r>
     </w:p>
     <w:p>
@@ -412,7 +412,7 @@
     <w:p>
       <w:pPr/>
       <w:r>
-        <w:t>12.2. La operación 24/7 de R360 no implica atención técnica ni disponibilidad garantizada 24/7. Los horarios, contacto de emergencia, severidades, tiempos de primera respuesta, recuperación, escalamiento y remedios deberán acordarse expresamente. Primera respuesta y recuperación son métricas distintas y no equivalen a resolución definitiva.</w:t>
+        <w:t>12.2. La operación continua de los servicios administrados mediante la plataforma no implica atención técnica ni disponibilidad garantizada 24/7. Los horarios, contacto de emergencia, severidades, tiempos de primera respuesta, recuperación, escalamiento y remedios deberán acordarse expresamente. Primera respuesta y recuperación son métricas distintas y no equivalen a resolución definitiva.</w:t>
       </w:r>
     </w:p>
     <w:p>
@@ -682,7 +682,7 @@
     <w:p>
       <w:pPr/>
       <w:r>
-        <w:t>20.2. Ninguna parte transferirá íntegramente su posición contractual sin consentimiento escrito de la otra, salvo la designación de EL CESIONARIO prevista expresamente. La contratación de terceros no libera a EL PRESTADOR.</w:t>
+        <w:t>20.2. La sustitución de cualquiera de LAS PARTES como contratante requerirá un convenio escrito firmado por ambas y por la persona que asuma la posición contractual. La designación de EL CESIONARIO conforme a la cláusula 14 no sustituye por sí misma a EL CLIENTE ni modifica sus obligaciones. La contratación de terceros no libera a EL PRESTADOR.</w:t>
       </w:r>
     </w:p>
     <w:p>
@@ -690,7 +690,7 @@
         <w:jc w:val="left"/>
       </w:pPr>
       <w:r>
-        <w:t>20.3. Este contrato se regirá por las leyes mexicanas, incluidas las disposiciones civiles o mercantiles que correspondan a la naturaleza del acto, derechos de autor y protección de datos. LAS PARTES intentarán resolver diferencias mediante negociación entre sus representantes durante __________ días hábiles desde el aviso de controversia, sin impedir medidas urgentes ni interrumpir plazos legales por ese solo hecho.</w:t>
+        <w:t>20.3. Este contrato se regirá por las leyes mexicanas, incluidas las disposiciones civiles o mercantiles que correspondan a la naturaleza del acto, derechos de autor y protección de datos. LAS PARTES intentarán resolver diferencias mediante negociación directa entre LAS PARTES durante __________ días hábiles desde el aviso de controversia, sin impedir medidas urgentes ni interrumpir plazos legales por ese solo hecho.</w:t>
       </w:r>
     </w:p>
     <w:p>
@@ -783,7 +783,7 @@
     <w:p>
       <w:pPr/>
       <w:r>
-        <w:t>PWA instalable para computadora y móvil, con captura por perfil y pasos, confirmación de guardado, prevención de duplicados por reintento y aviso de modificaciones simultáneas. Administración por R360 de cuentas, usuarios y permisos. Configuración por cliente de campos, formatos, coberturas y reglas dentro de las posibilidades acordadas. Separación de información entre cuentas. Uso con internet y validación de dispositivos, tamaños y formatos soportados.</w:t>
+        <w:t>PWA instalable para computadora y móvil, con captura por perfil y pasos, confirmación de guardado, prevención de duplicados por reintento y aviso de modificaciones simultáneas. Administración de cuentas, usuarios y permisos por EL CLIENTE. Configuración por cliente de campos, formatos, coberturas y reglas dentro de las posibilidades acordadas. Separación de información entre cuentas. Uso con internet y validación de dispositivos, tamaños y formatos soportados.</w:t>
       </w:r>
     </w:p>
     <w:p>
@@ -871,13 +871,13 @@
     <w:p>
       <w:pPr/>
       <w:r>
-        <w:t>API para consultar, registrar y actualizar información autorizada de servicios habilitados, con autenticación, versionado, prevención de duplicados, documentación, errores y reintentos. Exportaciones PDF/CSV y equivalencias de datos para conexiones acordadas. La API de ambos servicios iniciales deberá funcionar y estar documentada al cierre del mes 2; posteriormente se ampliará al portafolio incorporado. Se incluye la importación y exportación por cliente de R360, individual y por lotes según el recorrido aprobado y el inventario de integraciones que LAS PARTES documenten durante el proyecto. Se definirá una estructura común de información de CRM Legal R360 y sus equivalencias con cada sistema externo. JSON será un formato preferente para API cuando el tercero lo soporte; los archivos de intercambio podrán ser JSON, CSV o Excel conforme a las especificaciones de cada conexión. La compatibilidad de cada conexión se determinará conforme a las especificaciones documentadas del sistema externo.</w:t>
+        <w:t>API para consultar, registrar y actualizar información autorizada de servicios habilitados, con autenticación, versionado, prevención de duplicados, documentación, errores y reintentos. Exportaciones PDF/CSV y equivalencias de datos para conexiones acordadas. La API de ambos servicios iniciales deberá funcionar y estar documentada al cierre del mes 2; posteriormente se ampliará al portafolio incorporado. Se incluye la importación y exportación por cliente administrado a través de la plataforma, individual y por lotes según el recorrido aprobado y el inventario de integraciones que LAS PARTES documenten durante el proyecto. Se definirá una estructura común de información de CRM Legal R360 y sus equivalencias con cada sistema externo. JSON será un formato preferente para API cuando el tercero lo soporte; los archivos de intercambio podrán ser JSON, CSV o Excel conforme a las especificaciones de cada conexión. La compatibilidad de cada conexión se determinará conforme a las especificaciones documentadas del sistema externo.</w:t>
       </w:r>
     </w:p>
     <w:p>
       <w:pPr/>
       <w:r>
-        <w:t>Cada ficha de intercambio identificará entidades y campos, sentido de flujo, identificadores, catálogos, documentos admitidos, formato, mecanismo de envío, permisos, frecuencia, volumen máximo por lote y reglas de validación, duplicados, actualización y trazabilidad. La importación mostrará el resultado de validación, registros aceptados o rechazados y sus motivos; no modificará datos de otra cuenta ni producirá duplicados por reintento. Se acordará el tratamiento de errores y de resultados parciales. Las exportaciones respetarán filtros y permisos por cliente. No se enviarán datos entre clientes de R360 sin autorización.</w:t>
+        <w:t>Cada ficha de intercambio identificará entidades y campos, sentido de flujo, identificadores, catálogos, documentos admitidos, formato, mecanismo de envío, permisos, frecuencia, volumen máximo por lote y reglas de validación, duplicados, actualización y trazabilidad. La importación mostrará el resultado de validación, registros aceptados o rechazados y sus motivos; no modificará datos de otra cuenta ni producirá duplicados por reintento. Se acordará el tratamiento de errores y de resultados parciales. Las exportaciones respetarán filtros y permisos por cliente. No se enviarán datos entre cuentas de clientes de la plataforma sin autorización.</w:t>
       </w:r>
     </w:p>
     <w:p>
@@ -2267,7 +2267,7 @@
         <w:jc w:val="left"/>
       </w:pPr>
       <w:r>
-        <w:t>EL CLIENTE determinará finalidades, licitud, avisos de privacidad y atención de derechos de titulares; en la medida en que decida el tratamiento, actuará como responsable. EL PRESTADOR actuará como encargado respecto de datos a los que acceda por instrucciones de EL CLIENTE para desarrollar, configurar, probar, soportar, respaldar y recuperar el sistema. El tratamiento que cada parte realice por obligación propia, como facturación, se sujetará a su responsabilidad y aviso aplicable. Si los clientes de R360 generan otros roles, deberán identificarse antes de tratar sus datos; este contrato no presume autorizaciones de terceros.</w:t>
+        <w:t>EL CLIENTE determinará finalidades, licitud, avisos de privacidad y atención de derechos de titulares; en la medida en que decida el tratamiento, actuará como responsable. EL PRESTADOR actuará como encargado respecto de datos a los que acceda por instrucciones de EL CLIENTE para desarrollar, configurar, probar, soportar, respaldar y recuperar el sistema. El tratamiento que cada parte realice por obligación propia, como facturación, se sujetará a su responsabilidad y aviso aplicable. Si intervienen terceros con otros roles de tratamiento, estos deberán identificarse antes de tratar sus datos; este contrato no presume autorizaciones de terceros.</w:t>
       </w:r>
     </w:p>
     <w:p>
@@ -6459,7 +6459,7 @@
                 <w:color w:val="000000"/>
                 <w:sz w:val="19"/>
               </w:rPr>
-              <w:t>Autorización de representantes facultados y fecha</w:t>
+              <w:t>Autorización de LAS PARTES y fecha</w:t>
             </w:r>
           </w:p>
         </w:tc>

</xml_diff>